<commit_message>
Capella article: figures about 60% larger on the page (gallery in two columns, tighter Jupiter crop, larger text in graphs), narrower margins
Co-Authored-By: Claude Sonnet 5.5 <noreply@anthropic.com>
</commit_message>
<xml_diff>
--- a/docs/capella/Capella_article.docx
+++ b/docs/capella/Capella_article.docx
@@ -245,7 +245,7 @@
       <w:r>
         <w:drawing>
           <wp:inline>
-            <wp:extent cx="5334000" cy="2489200"/>
+            <wp:extent cx="5334000" cy="6543040"/>
             <wp:effectExtent b="0" l="0" r="0" t="0"/>
             <wp:docPr descr="Everything the telescope stacked on the two nights, as the live stacker produced it: background extraction, colour neutralisation and a hyperbolic stretch, nothing else. Each frame is 75 × 50 arcminutes." title="" id="21" name="Picture"/>
             <a:graphic>
@@ -266,7 +266,7 @@
                   <pic:spPr bwMode="auto">
                     <a:xfrm>
                       <a:off x="0" y="0"/>
-                      <a:ext cx="5334000" cy="2489200"/>
+                      <a:ext cx="5334000" cy="6543040"/>
                     </a:xfrm>
                     <a:prstGeom prst="rect">
                       <a:avLst/>
@@ -825,7 +825,7 @@
       <w:r>
         <w:drawing>
           <wp:inline>
-            <wp:extent cx="5334000" cy="5867400"/>
+            <wp:extent cx="5334000" cy="7041790"/>
             <wp:effectExtent b="0" l="0" r="0" t="0"/>
             <wp:docPr descr="Sky level and verdict for every frame, with the target imaged underneath. Night one (top): a flat clear sky from 23:15. Night two (bottom): the sky level wanders between 500 and 5,000 ADU per second as cloud passes, the supervisor changes target when the sky turns bad, and the last 80 minutes (04:00-05:25) are clean. Times BST." title="" id="30" name="Picture"/>
             <a:graphic>
@@ -846,7 +846,7 @@
                   <pic:spPr bwMode="auto">
                     <a:xfrm>
                       <a:off x="0" y="0"/>
-                      <a:ext cx="5334000" cy="5867400"/>
+                      <a:ext cx="5334000" cy="7041790"/>
                     </a:xfrm>
                     <a:prstGeom prst="rect">
                       <a:avLst/>
@@ -942,7 +942,7 @@
       <w:r>
         <w:drawing>
           <wp:inline>
-            <wp:extent cx="5334000" cy="1920240"/>
+            <wp:extent cx="5334000" cy="2459743"/>
             <wp:effectExtent b="0" l="0" r="0" t="0"/>
             <wp:docPr descr="Left: what the analyser made of each frame on the two nights. Right: how much exposure ended up in a stack." title="" id="33" name="Picture"/>
             <a:graphic>
@@ -963,7 +963,7 @@
                   <pic:spPr bwMode="auto">
                     <a:xfrm>
                       <a:off x="0" y="0"/>
-                      <a:ext cx="5334000" cy="1920240"/>
+                      <a:ext cx="5334000" cy="2459743"/>
                     </a:xfrm>
                     <a:prstGeom prst="rect">
                       <a:avLst/>
@@ -1168,7 +1168,7 @@
       <w:r>
         <w:drawing>
           <wp:inline>
-            <wp:extent cx="5334000" cy="2590800"/>
+            <wp:extent cx="5199888" cy="2523744"/>
             <wp:effectExtent b="0" l="0" r="0" t="0"/>
             <wp:docPr descr="Sky level for every frame, by verdict. The two clear-sky peaks are ISO 200 (left) and ISO 800 (right); cloud and haze are the tail towards higher levels." title="" id="39" name="Picture"/>
             <a:graphic>
@@ -1189,7 +1189,7 @@
                   <pic:spPr bwMode="auto">
                     <a:xfrm>
                       <a:off x="0" y="0"/>
-                      <a:ext cx="5334000" cy="2590800"/>
+                      <a:ext cx="5199888" cy="2523744"/>
                     </a:xfrm>
                     <a:prstGeom prst="rect">
                       <a:avLst/>
@@ -1489,7 +1489,7 @@
       <w:r>
         <w:drawing>
           <wp:inline>
-            <wp:extent cx="5334000" cy="1920240"/>
+            <wp:extent cx="5334000" cy="2459743"/>
             <wp:effectExtent b="0" l="0" r="0" t="0"/>
             <wp:docPr descr="Night two: the forecast quality for each hour (yellow) against the fraction of that hour in which the telescope took usable frames (dark). The right-hand panel ranks the seven models by mean absolute error over those ten hours. One night only." title="" id="47" name="Picture"/>
             <a:graphic>
@@ -1510,7 +1510,7 @@
                   <pic:spPr bwMode="auto">
                     <a:xfrm>
                       <a:off x="0" y="0"/>
-                      <a:ext cx="5334000" cy="1920240"/>
+                      <a:ext cx="5334000" cy="2459743"/>
                     </a:xfrm>
                     <a:prstGeom prst="rect">
                       <a:avLst/>

</xml_diff>